<commit_message>
Added Modular Houses & Assets
</commit_message>
<xml_diff>
--- a/References.docx
+++ b/References.docx
@@ -30,14 +30,13 @@
           <w:numId w:val="1"/>
         </w:numPr>
       </w:pPr>
+      <w:proofErr w:type="spellStart"/>
       <w:r>
         <w:t>ProBuilder</w:t>
       </w:r>
-      <w:r>
-        <w:t xml:space="preserve"> </w:t>
-      </w:r>
-      <w:r>
-        <w:t>– Unity</w:t>
+      <w:proofErr w:type="spellEnd"/>
+      <w:r>
+        <w:t xml:space="preserve"> – Unity</w:t>
       </w:r>
     </w:p>
     <w:p>
@@ -48,8 +47,21 @@
           <w:numId w:val="1"/>
         </w:numPr>
       </w:pPr>
-      <w:r>
-        <w:t>ProGrids – com.unity.progrids (Unity Package Manager)</w:t>
+      <w:proofErr w:type="spellStart"/>
+      <w:r>
+        <w:t>ProGrids</w:t>
+      </w:r>
+      <w:proofErr w:type="spellEnd"/>
+      <w:r>
+        <w:t xml:space="preserve"> – </w:t>
+      </w:r>
+      <w:proofErr w:type="spellStart"/>
+      <w:r>
+        <w:t>com.unity.progrids</w:t>
+      </w:r>
+      <w:proofErr w:type="spellEnd"/>
+      <w:r>
+        <w:t xml:space="preserve"> (Unity Package Manager)</w:t>
       </w:r>
     </w:p>
     <w:p>
@@ -135,6 +147,9 @@
         <w:t>Medieval Cartoon Warriors</w:t>
       </w:r>
       <w:r>
+        <w:t xml:space="preserve"> (Characters)</w:t>
+      </w:r>
+      <w:r>
         <w:t xml:space="preserve"> - </w:t>
       </w:r>
       <w:hyperlink r:id="rId6" w:history="1">
@@ -142,19 +157,158 @@
           <w:rPr>
             <w:rStyle w:val="Hyperlink"/>
           </w:rPr>
-          <w:t>https://assetstore.u</w:t>
+          <w:t>https://assetstore.unity.com/packages/3d/characters/medieval-cartoon-warriors-90079</w:t>
+        </w:r>
+      </w:hyperlink>
+    </w:p>
+    <w:p>
+      <w:pPr>
+        <w:pStyle w:val="ListParagraph"/>
+        <w:numPr>
+          <w:ilvl w:val="0"/>
+          <w:numId w:val="1"/>
+        </w:numPr>
+      </w:pPr>
+      <w:r>
+        <w:t>Medieval house modular lite</w:t>
+      </w:r>
+      <w:r>
+        <w:t xml:space="preserve"> (Houses)</w:t>
+      </w:r>
+      <w:r>
+        <w:t xml:space="preserve"> - </w:t>
+      </w:r>
+      <w:hyperlink r:id="rId7" w:history="1">
+        <w:r>
+          <w:rPr>
+            <w:rStyle w:val="Hyperlink"/>
+          </w:rPr>
+          <w:t>https://assetstore.unity.com/packages/3d/environments/fantasy/medieval-house-modular-lite-189718</w:t>
+        </w:r>
+      </w:hyperlink>
+    </w:p>
+    <w:p>
+      <w:pPr>
+        <w:pStyle w:val="ListParagraph"/>
+        <w:numPr>
+          <w:ilvl w:val="0"/>
+          <w:numId w:val="1"/>
+        </w:numPr>
+      </w:pPr>
+      <w:r>
+        <w:t>Alchemy Lab Props</w:t>
+      </w:r>
+      <w:r>
+        <w:t xml:space="preserve"> (Props and </w:t>
+      </w:r>
+      <w:proofErr w:type="spellStart"/>
+      <w:r>
+        <w:t>Furntiures</w:t>
+      </w:r>
+      <w:proofErr w:type="spellEnd"/>
+      <w:r>
+        <w:t>)</w:t>
+      </w:r>
+      <w:r>
+        <w:t xml:space="preserve"> (Built-in-Gamma version)</w:t>
+      </w:r>
+      <w:r>
+        <w:t xml:space="preserve"> - </w:t>
+      </w:r>
+      <w:hyperlink r:id="rId8" w:history="1">
+        <w:r>
+          <w:rPr>
+            <w:rStyle w:val="Hyperlink"/>
+          </w:rPr>
+          <w:t>https://assetstore.unity.com/packages/3d/props/furniture/alchemy-lab-props-41758</w:t>
+        </w:r>
+      </w:hyperlink>
+    </w:p>
+    <w:p>
+      <w:pPr>
+        <w:pStyle w:val="ListParagraph"/>
+        <w:numPr>
+          <w:ilvl w:val="0"/>
+          <w:numId w:val="1"/>
+        </w:numPr>
+      </w:pPr>
+      <w:r>
+        <w:t>Reading Material</w:t>
+      </w:r>
+      <w:r>
+        <w:t xml:space="preserve"> (difference between linear and gamma workflow) </w:t>
+      </w:r>
+      <w:r>
+        <w:t xml:space="preserve">- </w:t>
+      </w:r>
+      <w:hyperlink r:id="rId9" w:history="1">
+        <w:r>
+          <w:rPr>
+            <w:rStyle w:val="Hyperlink"/>
+          </w:rPr>
+          <w:t>https://docs.unity3d.com/Manual/LinearRendering-LinearOrGammaWorkflow.html</w:t>
+        </w:r>
+      </w:hyperlink>
+    </w:p>
+    <w:p>
+      <w:pPr>
+        <w:pStyle w:val="ListParagraph"/>
+        <w:numPr>
+          <w:ilvl w:val="0"/>
+          <w:numId w:val="1"/>
+        </w:numPr>
+      </w:pPr>
+      <w:r>
+        <w:t>Dinner Table (</w:t>
+      </w:r>
+      <w:r>
+        <w:t xml:space="preserve">Food </w:t>
+      </w:r>
+      <w:r>
+        <w:t xml:space="preserve">&amp; Other </w:t>
+      </w:r>
+      <w:r>
+        <w:t>Items</w:t>
+      </w:r>
+      <w:r>
+        <w:t>)</w:t>
+      </w:r>
+      <w:r>
+        <w:t xml:space="preserve"> </w:t>
+      </w:r>
+      <w:r>
+        <w:t xml:space="preserve">- </w:t>
+      </w:r>
+      <w:hyperlink r:id="rId10" w:history="1">
+        <w:r>
+          <w:rPr>
+            <w:rStyle w:val="Hyperlink"/>
+          </w:rPr>
+          <w:t>https://assetsto</w:t>
         </w:r>
         <w:r>
           <w:rPr>
             <w:rStyle w:val="Hyperlink"/>
           </w:rPr>
-          <w:t>n</w:t>
+          <w:t>r</w:t>
         </w:r>
         <w:r>
           <w:rPr>
             <w:rStyle w:val="Hyperlink"/>
           </w:rPr>
-          <w:t>ity.com/packages/3d/characters/medieval-cartoon-warriors-90079</w:t>
+          <w:t>e.un</w:t>
+        </w:r>
+        <w:r>
+          <w:rPr>
+            <w:rStyle w:val="Hyperlink"/>
+          </w:rPr>
+          <w:t>i</w:t>
+        </w:r>
+        <w:r>
+          <w:rPr>
+            <w:rStyle w:val="Hyperlink"/>
+          </w:rPr>
+          <w:t>ty.com/packages/3d/environments/fantasy/dinner-table-55180</w:t>
         </w:r>
       </w:hyperlink>
     </w:p>
@@ -167,26 +321,17 @@
         </w:numPr>
       </w:pPr>
       <w:r>
-        <w:t xml:space="preserve">Medieval house modular lite - </w:t>
-      </w:r>
-      <w:hyperlink r:id="rId7" w:history="1">
+        <w:t>A Piece of Nature</w:t>
+      </w:r>
+      <w:r>
+        <w:t xml:space="preserve"> - </w:t>
+      </w:r>
+      <w:hyperlink r:id="rId11" w:history="1">
         <w:r>
           <w:rPr>
             <w:rStyle w:val="Hyperlink"/>
           </w:rPr>
-          <w:t>https://assetstore</w:t>
-        </w:r>
-        <w:r>
-          <w:rPr>
-            <w:rStyle w:val="Hyperlink"/>
-          </w:rPr>
-          <w:t>.</w:t>
-        </w:r>
-        <w:r>
-          <w:rPr>
-            <w:rStyle w:val="Hyperlink"/>
-          </w:rPr>
-          <w:t>unity.com/packages/3d/environments/fantasy/medieval-house-modular-lite-189718</w:t>
+          <w:t>https://assetstore.unity.com/packages/3d/environments/fantasy/a-piece-of-nature-40538</w:t>
         </w:r>
       </w:hyperlink>
     </w:p>
@@ -199,32 +344,17 @@
         </w:numPr>
       </w:pPr>
       <w:r>
-        <w:t>Alchemy Lab Props</w:t>
-      </w:r>
-      <w:r>
-        <w:t xml:space="preserve"> (Built-in-Gamma version)</w:t>
+        <w:t>Brazier Set</w:t>
       </w:r>
       <w:r>
         <w:t xml:space="preserve"> - </w:t>
       </w:r>
-      <w:hyperlink r:id="rId8" w:history="1">
+      <w:hyperlink r:id="rId12" w:history="1">
         <w:r>
           <w:rPr>
             <w:rStyle w:val="Hyperlink"/>
           </w:rPr>
-          <w:t>https://assetstore.u</w:t>
-        </w:r>
-        <w:r>
-          <w:rPr>
-            <w:rStyle w:val="Hyperlink"/>
-          </w:rPr>
-          <w:t>n</w:t>
-        </w:r>
-        <w:r>
-          <w:rPr>
-            <w:rStyle w:val="Hyperlink"/>
-          </w:rPr>
-          <w:t>ity.com/packages/3d/props/furniture/alchemy-lab-props-41758</w:t>
+          <w:t>https://assetstore.unity.com/packages/3d/props/brazier-set-37623</w:t>
         </w:r>
       </w:hyperlink>
     </w:p>
@@ -236,18 +366,6 @@
           <w:numId w:val="1"/>
         </w:numPr>
       </w:pPr>
-      <w:r>
-        <w:t>Reading Material</w:t>
-      </w:r>
-      <w:r>
-        <w:t xml:space="preserve"> (difference between linear and gamma workflow) </w:t>
-      </w:r>
-      <w:r>
-        <w:t xml:space="preserve">- </w:t>
-      </w:r>
-      <w:r>
-        <w:t>https://docs.unity3d.com/Manual/LinearRendering-LinearOrGammaWorkflow.html</w:t>
-      </w:r>
     </w:p>
     <w:p/>
     <w:sectPr>

</xml_diff>

<commit_message>
Added Cursors and Fixed Camera Movement
</commit_message>
<xml_diff>
--- a/References.docx
+++ b/References.docx
@@ -19,27 +19,36 @@
           <w:sz w:val="44"/>
           <w:szCs w:val="44"/>
         </w:rPr>
-        <w:t>TEXT</w:t>
-      </w:r>
-    </w:p>
-    <w:p>
-      <w:pPr>
-        <w:pStyle w:val="ListParagraph"/>
-        <w:numPr>
-          <w:ilvl w:val="0"/>
-          <w:numId w:val="1"/>
-        </w:numPr>
-        <w:rPr>
-          <w:b/>
-          <w:bCs/>
-        </w:rPr>
-      </w:pPr>
-      <w:r>
-        <w:rPr>
-          <w:b/>
-          <w:bCs/>
-        </w:rPr>
-        <w:t xml:space="preserve">Kelt Caps Freehand Font – </w:t>
+        <w:t>FONT</w:t>
+      </w:r>
+    </w:p>
+    <w:p>
+      <w:pPr>
+        <w:pStyle w:val="ListParagraph"/>
+        <w:numPr>
+          <w:ilvl w:val="0"/>
+          <w:numId w:val="1"/>
+        </w:numPr>
+        <w:rPr>
+          <w:b/>
+          <w:bCs/>
+        </w:rPr>
+      </w:pPr>
+      <w:proofErr w:type="spellStart"/>
+      <w:r>
+        <w:rPr>
+          <w:b/>
+          <w:bCs/>
+        </w:rPr>
+        <w:t>Kelt</w:t>
+      </w:r>
+      <w:proofErr w:type="spellEnd"/>
+      <w:r>
+        <w:rPr>
+          <w:b/>
+          <w:bCs/>
+        </w:rPr>
+        <w:t xml:space="preserve"> Caps Freehand Font – </w:t>
       </w:r>
     </w:p>
     <w:p>
@@ -96,6 +105,7 @@
           <w:numId w:val="1"/>
         </w:numPr>
       </w:pPr>
+      <w:proofErr w:type="spellStart"/>
       <w:r>
         <w:rPr>
           <w:b/>
@@ -103,6 +113,7 @@
         </w:rPr>
         <w:t>ProBuilder</w:t>
       </w:r>
+      <w:proofErr w:type="spellEnd"/>
       <w:r>
         <w:t xml:space="preserve"> – Unity</w:t>
       </w:r>
@@ -137,6 +148,7 @@
           <w:numId w:val="1"/>
         </w:numPr>
       </w:pPr>
+      <w:proofErr w:type="spellStart"/>
       <w:r>
         <w:rPr>
           <w:b/>
@@ -144,6 +156,7 @@
         </w:rPr>
         <w:t>Cinemachine</w:t>
       </w:r>
+      <w:proofErr w:type="spellEnd"/>
       <w:r>
         <w:t xml:space="preserve"> – Unity</w:t>
       </w:r>
@@ -156,6 +169,7 @@
           <w:numId w:val="1"/>
         </w:numPr>
       </w:pPr>
+      <w:proofErr w:type="spellStart"/>
       <w:r>
         <w:rPr>
           <w:b/>
@@ -163,8 +177,22 @@
         </w:rPr>
         <w:t>ProGrids</w:t>
       </w:r>
-      <w:r>
-        <w:t xml:space="preserve"> – com.unity.progrids (Unity Package Manager)</w:t>
+      <w:proofErr w:type="spellEnd"/>
+      <w:r>
+        <w:t xml:space="preserve"> – </w:t>
+      </w:r>
+      <w:proofErr w:type="spellStart"/>
+      <w:proofErr w:type="gramStart"/>
+      <w:r>
+        <w:t>com.unity</w:t>
+      </w:r>
+      <w:proofErr w:type="gramEnd"/>
+      <w:r>
+        <w:t>.progrids</w:t>
+      </w:r>
+      <w:proofErr w:type="spellEnd"/>
+      <w:r>
+        <w:t xml:space="preserve"> (Unity Package Manager)</w:t>
       </w:r>
     </w:p>
     <w:p>
@@ -426,7 +454,23 @@
           <w:b/>
           <w:bCs/>
         </w:rPr>
-        <w:t xml:space="preserve"> (Props and Furntiures)</w:t>
+        <w:t xml:space="preserve"> (Props and </w:t>
+      </w:r>
+      <w:proofErr w:type="spellStart"/>
+      <w:r>
+        <w:rPr>
+          <w:b/>
+          <w:bCs/>
+        </w:rPr>
+        <w:t>Furntiures</w:t>
+      </w:r>
+      <w:proofErr w:type="spellEnd"/>
+      <w:r>
+        <w:rPr>
+          <w:b/>
+          <w:bCs/>
+        </w:rPr>
+        <w:t>)</w:t>
       </w:r>
       <w:r>
         <w:rPr>
@@ -801,12 +845,21 @@
           <w:bCs/>
         </w:rPr>
       </w:pPr>
-      <w:r>
-        <w:rPr>
-          <w:b/>
-          <w:bCs/>
-        </w:rPr>
-        <w:t>Lowpoly Wells</w:t>
+      <w:proofErr w:type="spellStart"/>
+      <w:r>
+        <w:rPr>
+          <w:b/>
+          <w:bCs/>
+        </w:rPr>
+        <w:t>Lowpoly</w:t>
+      </w:r>
+      <w:proofErr w:type="spellEnd"/>
+      <w:r>
+        <w:rPr>
+          <w:b/>
+          <w:bCs/>
+        </w:rPr>
+        <w:t xml:space="preserve"> Wells</w:t>
       </w:r>
       <w:r>
         <w:rPr>
@@ -950,7 +1003,23 @@
           <w:b/>
           <w:bCs/>
         </w:rPr>
-        <w:t>Stylized Environnement - Free Pack</w:t>
+        <w:t xml:space="preserve">Stylized </w:t>
+      </w:r>
+      <w:proofErr w:type="spellStart"/>
+      <w:r>
+        <w:rPr>
+          <w:b/>
+          <w:bCs/>
+        </w:rPr>
+        <w:t>Environnement</w:t>
+      </w:r>
+      <w:proofErr w:type="spellEnd"/>
+      <w:r>
+        <w:rPr>
+          <w:b/>
+          <w:bCs/>
+        </w:rPr>
+        <w:t xml:space="preserve"> - Free Pack</w:t>
       </w:r>
       <w:r>
         <w:rPr>
@@ -1105,12 +1174,21 @@
           <w:bCs/>
         </w:rPr>
       </w:pPr>
-      <w:r>
-        <w:rPr>
-          <w:b/>
-          <w:bCs/>
-        </w:rPr>
-        <w:t>Handpainted Forest Pack Lite</w:t>
+      <w:proofErr w:type="spellStart"/>
+      <w:r>
+        <w:rPr>
+          <w:b/>
+          <w:bCs/>
+        </w:rPr>
+        <w:t>Handpainted</w:t>
+      </w:r>
+      <w:proofErr w:type="spellEnd"/>
+      <w:r>
+        <w:rPr>
+          <w:b/>
+          <w:bCs/>
+        </w:rPr>
+        <w:t xml:space="preserve"> Forest Pack Lite</w:t>
       </w:r>
       <w:r>
         <w:rPr>
@@ -1265,12 +1343,21 @@
           <w:bCs/>
         </w:rPr>
       </w:pPr>
-      <w:r>
-        <w:rPr>
-          <w:b/>
-          <w:bCs/>
-        </w:rPr>
-        <w:t>Handpainted Turntable Platforms</w:t>
+      <w:proofErr w:type="spellStart"/>
+      <w:r>
+        <w:rPr>
+          <w:b/>
+          <w:bCs/>
+        </w:rPr>
+        <w:t>Handpainted</w:t>
+      </w:r>
+      <w:proofErr w:type="spellEnd"/>
+      <w:r>
+        <w:rPr>
+          <w:b/>
+          <w:bCs/>
+        </w:rPr>
+        <w:t xml:space="preserve"> Turntable Platforms</w:t>
       </w:r>
       <w:r>
         <w:rPr>
@@ -1562,8 +1649,17 @@
           <w:b/>
           <w:bCs/>
         </w:rPr>
-        <w:t>Stylized Rock | Agustin Hönnun</w:t>
-      </w:r>
+        <w:t xml:space="preserve">Stylized Rock | Agustin </w:t>
+      </w:r>
+      <w:proofErr w:type="spellStart"/>
+      <w:r>
+        <w:rPr>
+          <w:b/>
+          <w:bCs/>
+        </w:rPr>
+        <w:t>Hönnun</w:t>
+      </w:r>
+      <w:proofErr w:type="spellEnd"/>
       <w:r>
         <w:rPr>
           <w:b/>
@@ -1576,7 +1672,55 @@
           <w:b/>
           <w:bCs/>
         </w:rPr>
-        <w:t>"Stylized Rock | Agustin Hönnun" (https://skfb.ly/6Y8SV) by Agustín Hönnun is licensed under Creative Commons Attribution (</w:t>
+        <w:t xml:space="preserve">"Stylized Rock | Agustin </w:t>
+      </w:r>
+      <w:proofErr w:type="spellStart"/>
+      <w:r>
+        <w:rPr>
+          <w:b/>
+          <w:bCs/>
+        </w:rPr>
+        <w:t>Hönnun</w:t>
+      </w:r>
+      <w:proofErr w:type="spellEnd"/>
+      <w:r>
+        <w:rPr>
+          <w:b/>
+          <w:bCs/>
+        </w:rPr>
+        <w:t xml:space="preserve">" (https://skfb.ly/6Y8SV) by </w:t>
+      </w:r>
+      <w:proofErr w:type="spellStart"/>
+      <w:r>
+        <w:rPr>
+          <w:b/>
+          <w:bCs/>
+        </w:rPr>
+        <w:t>Agustín</w:t>
+      </w:r>
+      <w:proofErr w:type="spellEnd"/>
+      <w:r>
+        <w:rPr>
+          <w:b/>
+          <w:bCs/>
+        </w:rPr>
+        <w:t xml:space="preserve"> </w:t>
+      </w:r>
+      <w:proofErr w:type="spellStart"/>
+      <w:r>
+        <w:rPr>
+          <w:b/>
+          <w:bCs/>
+        </w:rPr>
+        <w:t>Hönnun</w:t>
+      </w:r>
+      <w:proofErr w:type="spellEnd"/>
+      <w:r>
+        <w:rPr>
+          <w:b/>
+          <w:bCs/>
+        </w:rPr>
+        <w:t xml:space="preserve"> is licensed under Creative Commons Attribution (</w:t>
       </w:r>
       <w:hyperlink r:id="rId35" w:history="1">
         <w:r>
@@ -1593,14 +1737,30 @@
           <w:b/>
           <w:bCs/>
         </w:rPr>
-        <w:t>).</w:t>
-      </w:r>
-      <w:r>
-        <w:rPr>
-          <w:b/>
-          <w:bCs/>
-        </w:rPr>
-        <w:t xml:space="preserve"> ] </w:t>
+        <w:t>)</w:t>
+      </w:r>
+      <w:proofErr w:type="gramStart"/>
+      <w:r>
+        <w:rPr>
+          <w:b/>
+          <w:bCs/>
+        </w:rPr>
+        <w:t>.</w:t>
+      </w:r>
+      <w:r>
+        <w:rPr>
+          <w:b/>
+          <w:bCs/>
+        </w:rPr>
+        <w:t xml:space="preserve"> ]</w:t>
+      </w:r>
+      <w:proofErr w:type="gramEnd"/>
+      <w:r>
+        <w:rPr>
+          <w:b/>
+          <w:bCs/>
+        </w:rPr>
+        <w:t xml:space="preserve"> </w:t>
       </w:r>
       <w:r>
         <w:rPr>
@@ -1640,8 +1800,17 @@
           <w:b/>
           <w:bCs/>
         </w:rPr>
-        <w:t>Stylized Character Pedestal | Agustin Honnun</w:t>
-      </w:r>
+        <w:t xml:space="preserve">Stylized Character Pedestal | Agustin </w:t>
+      </w:r>
+      <w:proofErr w:type="spellStart"/>
+      <w:r>
+        <w:rPr>
+          <w:b/>
+          <w:bCs/>
+        </w:rPr>
+        <w:t>Honnun</w:t>
+      </w:r>
+      <w:proofErr w:type="spellEnd"/>
       <w:r>
         <w:rPr>
           <w:b/>
@@ -1668,7 +1837,55 @@
           <w:b/>
           <w:bCs/>
         </w:rPr>
-        <w:t>"Stylized Character Pedestal | Agustin Honnun" (https://skfb.ly/6UQpy) by Agustín Hönnun is licensed under Creative Commons Attribution (</w:t>
+        <w:t xml:space="preserve">"Stylized Character Pedestal | Agustin </w:t>
+      </w:r>
+      <w:proofErr w:type="spellStart"/>
+      <w:r>
+        <w:rPr>
+          <w:b/>
+          <w:bCs/>
+        </w:rPr>
+        <w:t>Honnun</w:t>
+      </w:r>
+      <w:proofErr w:type="spellEnd"/>
+      <w:r>
+        <w:rPr>
+          <w:b/>
+          <w:bCs/>
+        </w:rPr>
+        <w:t xml:space="preserve">" (https://skfb.ly/6UQpy) by </w:t>
+      </w:r>
+      <w:proofErr w:type="spellStart"/>
+      <w:r>
+        <w:rPr>
+          <w:b/>
+          <w:bCs/>
+        </w:rPr>
+        <w:t>Agustín</w:t>
+      </w:r>
+      <w:proofErr w:type="spellEnd"/>
+      <w:r>
+        <w:rPr>
+          <w:b/>
+          <w:bCs/>
+        </w:rPr>
+        <w:t xml:space="preserve"> </w:t>
+      </w:r>
+      <w:proofErr w:type="spellStart"/>
+      <w:r>
+        <w:rPr>
+          <w:b/>
+          <w:bCs/>
+        </w:rPr>
+        <w:t>Hönnun</w:t>
+      </w:r>
+      <w:proofErr w:type="spellEnd"/>
+      <w:r>
+        <w:rPr>
+          <w:b/>
+          <w:bCs/>
+        </w:rPr>
+        <w:t xml:space="preserve"> is licensed under Creative Commons Attribution (</w:t>
       </w:r>
       <w:hyperlink r:id="rId37" w:history="1">
         <w:r>
@@ -1685,14 +1902,30 @@
           <w:b/>
           <w:bCs/>
         </w:rPr>
-        <w:t>).</w:t>
-      </w:r>
-      <w:r>
-        <w:rPr>
-          <w:b/>
-          <w:bCs/>
-        </w:rPr>
-        <w:t xml:space="preserve"> ] </w:t>
+        <w:t>)</w:t>
+      </w:r>
+      <w:proofErr w:type="gramStart"/>
+      <w:r>
+        <w:rPr>
+          <w:b/>
+          <w:bCs/>
+        </w:rPr>
+        <w:t>.</w:t>
+      </w:r>
+      <w:r>
+        <w:rPr>
+          <w:b/>
+          <w:bCs/>
+        </w:rPr>
+        <w:t xml:space="preserve"> ]</w:t>
+      </w:r>
+      <w:proofErr w:type="gramEnd"/>
+      <w:r>
+        <w:rPr>
+          <w:b/>
+          <w:bCs/>
+        </w:rPr>
+        <w:t xml:space="preserve"> </w:t>
       </w:r>
       <w:r>
         <w:rPr>
@@ -1732,8 +1965,17 @@
           <w:b/>
           <w:bCs/>
         </w:rPr>
-        <w:t>Stylized Fences Set | Agustin Honnun</w:t>
-      </w:r>
+        <w:t xml:space="preserve">Stylized Fences Set | Agustin </w:t>
+      </w:r>
+      <w:proofErr w:type="spellStart"/>
+      <w:r>
+        <w:rPr>
+          <w:b/>
+          <w:bCs/>
+        </w:rPr>
+        <w:t>Honnun</w:t>
+      </w:r>
+      <w:proofErr w:type="spellEnd"/>
       <w:r>
         <w:rPr>
           <w:b/>
@@ -1746,7 +1988,55 @@
           <w:b/>
           <w:bCs/>
         </w:rPr>
-        <w:t>"Stylized Fences Set | Agustin Honnun" (https://skfb.ly/6WsVn) by Agustín Hönnun is licensed under Creative Commons Attribution (</w:t>
+        <w:t xml:space="preserve">"Stylized Fences Set | Agustin </w:t>
+      </w:r>
+      <w:proofErr w:type="spellStart"/>
+      <w:r>
+        <w:rPr>
+          <w:b/>
+          <w:bCs/>
+        </w:rPr>
+        <w:t>Honnun</w:t>
+      </w:r>
+      <w:proofErr w:type="spellEnd"/>
+      <w:r>
+        <w:rPr>
+          <w:b/>
+          <w:bCs/>
+        </w:rPr>
+        <w:t xml:space="preserve">" (https://skfb.ly/6WsVn) by </w:t>
+      </w:r>
+      <w:proofErr w:type="spellStart"/>
+      <w:r>
+        <w:rPr>
+          <w:b/>
+          <w:bCs/>
+        </w:rPr>
+        <w:t>Agustín</w:t>
+      </w:r>
+      <w:proofErr w:type="spellEnd"/>
+      <w:r>
+        <w:rPr>
+          <w:b/>
+          <w:bCs/>
+        </w:rPr>
+        <w:t xml:space="preserve"> </w:t>
+      </w:r>
+      <w:proofErr w:type="spellStart"/>
+      <w:r>
+        <w:rPr>
+          <w:b/>
+          <w:bCs/>
+        </w:rPr>
+        <w:t>Hönnun</w:t>
+      </w:r>
+      <w:proofErr w:type="spellEnd"/>
+      <w:r>
+        <w:rPr>
+          <w:b/>
+          <w:bCs/>
+        </w:rPr>
+        <w:t xml:space="preserve"> is licensed under Creative Commons Attribution (</w:t>
       </w:r>
       <w:hyperlink r:id="rId39" w:history="1">
         <w:r>
@@ -1763,14 +2053,30 @@
           <w:b/>
           <w:bCs/>
         </w:rPr>
-        <w:t>).</w:t>
-      </w:r>
-      <w:r>
-        <w:rPr>
-          <w:b/>
-          <w:bCs/>
-        </w:rPr>
-        <w:t xml:space="preserve"> ] – </w:t>
+        <w:t>)</w:t>
+      </w:r>
+      <w:proofErr w:type="gramStart"/>
+      <w:r>
+        <w:rPr>
+          <w:b/>
+          <w:bCs/>
+        </w:rPr>
+        <w:t>.</w:t>
+      </w:r>
+      <w:r>
+        <w:rPr>
+          <w:b/>
+          <w:bCs/>
+        </w:rPr>
+        <w:t xml:space="preserve"> ]</w:t>
+      </w:r>
+      <w:proofErr w:type="gramEnd"/>
+      <w:r>
+        <w:rPr>
+          <w:b/>
+          <w:bCs/>
+        </w:rPr>
+        <w:t xml:space="preserve"> – </w:t>
       </w:r>
     </w:p>
     <w:p>

</xml_diff>

<commit_message>
Created Shop Buy UI
</commit_message>
<xml_diff>
--- a/References.docx
+++ b/References.docx
@@ -34,12 +34,21 @@
           <w:bCs/>
         </w:rPr>
       </w:pPr>
-      <w:r>
-        <w:rPr>
-          <w:b/>
-          <w:bCs/>
-        </w:rPr>
-        <w:t xml:space="preserve">Kelt Caps Freehand Font – </w:t>
+      <w:proofErr w:type="spellStart"/>
+      <w:r>
+        <w:rPr>
+          <w:b/>
+          <w:bCs/>
+        </w:rPr>
+        <w:t>Kelt</w:t>
+      </w:r>
+      <w:proofErr w:type="spellEnd"/>
+      <w:r>
+        <w:rPr>
+          <w:b/>
+          <w:bCs/>
+        </w:rPr>
+        <w:t xml:space="preserve"> Caps Freehand Font – </w:t>
       </w:r>
     </w:p>
     <w:p>
@@ -146,12 +155,21 @@
           <w:bCs/>
         </w:rPr>
       </w:pPr>
-      <w:r>
-        <w:rPr>
-          <w:b/>
-          <w:bCs/>
-        </w:rPr>
-        <w:t>Resouces Pack #1</w:t>
+      <w:proofErr w:type="spellStart"/>
+      <w:r>
+        <w:rPr>
+          <w:b/>
+          <w:bCs/>
+        </w:rPr>
+        <w:t>Resouces</w:t>
+      </w:r>
+      <w:proofErr w:type="spellEnd"/>
+      <w:r>
+        <w:rPr>
+          <w:b/>
+          <w:bCs/>
+        </w:rPr>
+        <w:t xml:space="preserve"> Pack #1</w:t>
       </w:r>
       <w:r>
         <w:rPr>
@@ -280,8 +298,17 @@
           <w:b/>
           <w:bCs/>
         </w:rPr>
-        <w:t>Attack Icons Wesnoth</w:t>
-      </w:r>
+        <w:t xml:space="preserve">Attack Icons </w:t>
+      </w:r>
+      <w:proofErr w:type="spellStart"/>
+      <w:r>
+        <w:rPr>
+          <w:b/>
+          <w:bCs/>
+        </w:rPr>
+        <w:t>Wesnoth</w:t>
+      </w:r>
+      <w:proofErr w:type="spellEnd"/>
       <w:r>
         <w:rPr>
           <w:b/>
@@ -375,6 +402,7 @@
           <w:numId w:val="1"/>
         </w:numPr>
       </w:pPr>
+      <w:proofErr w:type="spellStart"/>
       <w:r>
         <w:rPr>
           <w:b/>
@@ -382,6 +410,7 @@
         </w:rPr>
         <w:t>ProBuilder</w:t>
       </w:r>
+      <w:proofErr w:type="spellEnd"/>
       <w:r>
         <w:t xml:space="preserve"> – Unity</w:t>
       </w:r>
@@ -416,6 +445,7 @@
           <w:numId w:val="1"/>
         </w:numPr>
       </w:pPr>
+      <w:proofErr w:type="spellStart"/>
       <w:r>
         <w:rPr>
           <w:b/>
@@ -423,6 +453,7 @@
         </w:rPr>
         <w:t>Cinemachine</w:t>
       </w:r>
+      <w:proofErr w:type="spellEnd"/>
       <w:r>
         <w:t xml:space="preserve"> – Unity</w:t>
       </w:r>
@@ -435,6 +466,7 @@
           <w:numId w:val="1"/>
         </w:numPr>
       </w:pPr>
+      <w:proofErr w:type="spellStart"/>
       <w:r>
         <w:rPr>
           <w:b/>
@@ -442,8 +474,17 @@
         </w:rPr>
         <w:t>ProGrids</w:t>
       </w:r>
-      <w:r>
-        <w:t xml:space="preserve"> – com.unity.progrids (Unity Package Manager)</w:t>
+      <w:proofErr w:type="spellEnd"/>
+      <w:r>
+        <w:t xml:space="preserve"> – </w:t>
+      </w:r>
+      <w:proofErr w:type="spellStart"/>
+      <w:r>
+        <w:t>com.unity.progrids</w:t>
+      </w:r>
+      <w:proofErr w:type="spellEnd"/>
+      <w:r>
+        <w:t xml:space="preserve"> (Unity Package Manager)</w:t>
       </w:r>
     </w:p>
     <w:p>
@@ -680,7 +721,23 @@
           <w:b/>
           <w:bCs/>
         </w:rPr>
-        <w:t xml:space="preserve"> (Props and Furntiures)</w:t>
+        <w:t xml:space="preserve"> (Props and </w:t>
+      </w:r>
+      <w:proofErr w:type="spellStart"/>
+      <w:r>
+        <w:rPr>
+          <w:b/>
+          <w:bCs/>
+        </w:rPr>
+        <w:t>Furntiures</w:t>
+      </w:r>
+      <w:proofErr w:type="spellEnd"/>
+      <w:r>
+        <w:rPr>
+          <w:b/>
+          <w:bCs/>
+        </w:rPr>
+        <w:t>)</w:t>
       </w:r>
       <w:r>
         <w:rPr>
@@ -1056,12 +1113,21 @@
           <w:bCs/>
         </w:rPr>
       </w:pPr>
-      <w:r>
-        <w:rPr>
-          <w:b/>
-          <w:bCs/>
-        </w:rPr>
-        <w:t>Lowpoly Wells</w:t>
+      <w:proofErr w:type="spellStart"/>
+      <w:r>
+        <w:rPr>
+          <w:b/>
+          <w:bCs/>
+        </w:rPr>
+        <w:t>Lowpoly</w:t>
+      </w:r>
+      <w:proofErr w:type="spellEnd"/>
+      <w:r>
+        <w:rPr>
+          <w:b/>
+          <w:bCs/>
+        </w:rPr>
+        <w:t xml:space="preserve"> Wells</w:t>
       </w:r>
       <w:r>
         <w:rPr>
@@ -1204,7 +1270,23 @@
           <w:b/>
           <w:bCs/>
         </w:rPr>
-        <w:t>Stylized Environnement - Free Pack</w:t>
+        <w:t xml:space="preserve">Stylized </w:t>
+      </w:r>
+      <w:proofErr w:type="spellStart"/>
+      <w:r>
+        <w:rPr>
+          <w:b/>
+          <w:bCs/>
+        </w:rPr>
+        <w:t>Environnement</w:t>
+      </w:r>
+      <w:proofErr w:type="spellEnd"/>
+      <w:r>
+        <w:rPr>
+          <w:b/>
+          <w:bCs/>
+        </w:rPr>
+        <w:t xml:space="preserve"> - Free Pack</w:t>
       </w:r>
       <w:r>
         <w:rPr>
@@ -1359,12 +1441,21 @@
           <w:bCs/>
         </w:rPr>
       </w:pPr>
-      <w:r>
-        <w:rPr>
-          <w:b/>
-          <w:bCs/>
-        </w:rPr>
-        <w:t>Handpainted Forest Pack Lite</w:t>
+      <w:proofErr w:type="spellStart"/>
+      <w:r>
+        <w:rPr>
+          <w:b/>
+          <w:bCs/>
+        </w:rPr>
+        <w:t>Handpainted</w:t>
+      </w:r>
+      <w:proofErr w:type="spellEnd"/>
+      <w:r>
+        <w:rPr>
+          <w:b/>
+          <w:bCs/>
+        </w:rPr>
+        <w:t xml:space="preserve"> Forest Pack Lite</w:t>
       </w:r>
       <w:r>
         <w:rPr>
@@ -1519,12 +1610,21 @@
           <w:bCs/>
         </w:rPr>
       </w:pPr>
-      <w:r>
-        <w:rPr>
-          <w:b/>
-          <w:bCs/>
-        </w:rPr>
-        <w:t>Handpainted Turntable Platforms</w:t>
+      <w:proofErr w:type="spellStart"/>
+      <w:r>
+        <w:rPr>
+          <w:b/>
+          <w:bCs/>
+        </w:rPr>
+        <w:t>Handpainted</w:t>
+      </w:r>
+      <w:proofErr w:type="spellEnd"/>
+      <w:r>
+        <w:rPr>
+          <w:b/>
+          <w:bCs/>
+        </w:rPr>
+        <w:t xml:space="preserve"> Turntable Platforms</w:t>
       </w:r>
       <w:r>
         <w:rPr>
@@ -1816,8 +1916,17 @@
           <w:b/>
           <w:bCs/>
         </w:rPr>
-        <w:t>Stylized Rock | Agustin Hönnun</w:t>
-      </w:r>
+        <w:t xml:space="preserve">Stylized Rock | Agustin </w:t>
+      </w:r>
+      <w:proofErr w:type="spellStart"/>
+      <w:r>
+        <w:rPr>
+          <w:b/>
+          <w:bCs/>
+        </w:rPr>
+        <w:t>Hönnun</w:t>
+      </w:r>
+      <w:proofErr w:type="spellEnd"/>
       <w:r>
         <w:rPr>
           <w:b/>
@@ -1830,7 +1939,55 @@
           <w:b/>
           <w:bCs/>
         </w:rPr>
-        <w:t>"Stylized Rock | Agustin Hönnun" (https://skfb.ly/6Y8SV) by Agustín Hönnun is licensed under Creative Commons Attribution (</w:t>
+        <w:t xml:space="preserve">"Stylized Rock | Agustin </w:t>
+      </w:r>
+      <w:proofErr w:type="spellStart"/>
+      <w:r>
+        <w:rPr>
+          <w:b/>
+          <w:bCs/>
+        </w:rPr>
+        <w:t>Hönnun</w:t>
+      </w:r>
+      <w:proofErr w:type="spellEnd"/>
+      <w:r>
+        <w:rPr>
+          <w:b/>
+          <w:bCs/>
+        </w:rPr>
+        <w:t xml:space="preserve">" (https://skfb.ly/6Y8SV) by </w:t>
+      </w:r>
+      <w:proofErr w:type="spellStart"/>
+      <w:r>
+        <w:rPr>
+          <w:b/>
+          <w:bCs/>
+        </w:rPr>
+        <w:t>Agustín</w:t>
+      </w:r>
+      <w:proofErr w:type="spellEnd"/>
+      <w:r>
+        <w:rPr>
+          <w:b/>
+          <w:bCs/>
+        </w:rPr>
+        <w:t xml:space="preserve"> </w:t>
+      </w:r>
+      <w:proofErr w:type="spellStart"/>
+      <w:r>
+        <w:rPr>
+          <w:b/>
+          <w:bCs/>
+        </w:rPr>
+        <w:t>Hönnun</w:t>
+      </w:r>
+      <w:proofErr w:type="spellEnd"/>
+      <w:r>
+        <w:rPr>
+          <w:b/>
+          <w:bCs/>
+        </w:rPr>
+        <w:t xml:space="preserve"> is licensed under Creative Commons Attribution (</w:t>
       </w:r>
       <w:hyperlink r:id="rId41" w:history="1">
         <w:r>
@@ -1894,8 +2051,17 @@
           <w:b/>
           <w:bCs/>
         </w:rPr>
-        <w:t>Stylized Character Pedestal | Agustin Honnun</w:t>
-      </w:r>
+        <w:t xml:space="preserve">Stylized Character Pedestal | Agustin </w:t>
+      </w:r>
+      <w:proofErr w:type="spellStart"/>
+      <w:r>
+        <w:rPr>
+          <w:b/>
+          <w:bCs/>
+        </w:rPr>
+        <w:t>Honnun</w:t>
+      </w:r>
+      <w:proofErr w:type="spellEnd"/>
       <w:r>
         <w:rPr>
           <w:b/>
@@ -1922,7 +2088,55 @@
           <w:b/>
           <w:bCs/>
         </w:rPr>
-        <w:t>"Stylized Character Pedestal | Agustin Honnun" (https://skfb.ly/6UQpy) by Agustín Hönnun is licensed under Creative Commons Attribution (</w:t>
+        <w:t xml:space="preserve">"Stylized Character Pedestal | Agustin </w:t>
+      </w:r>
+      <w:proofErr w:type="spellStart"/>
+      <w:r>
+        <w:rPr>
+          <w:b/>
+          <w:bCs/>
+        </w:rPr>
+        <w:t>Honnun</w:t>
+      </w:r>
+      <w:proofErr w:type="spellEnd"/>
+      <w:r>
+        <w:rPr>
+          <w:b/>
+          <w:bCs/>
+        </w:rPr>
+        <w:t xml:space="preserve">" (https://skfb.ly/6UQpy) by </w:t>
+      </w:r>
+      <w:proofErr w:type="spellStart"/>
+      <w:r>
+        <w:rPr>
+          <w:b/>
+          <w:bCs/>
+        </w:rPr>
+        <w:t>Agustín</w:t>
+      </w:r>
+      <w:proofErr w:type="spellEnd"/>
+      <w:r>
+        <w:rPr>
+          <w:b/>
+          <w:bCs/>
+        </w:rPr>
+        <w:t xml:space="preserve"> </w:t>
+      </w:r>
+      <w:proofErr w:type="spellStart"/>
+      <w:r>
+        <w:rPr>
+          <w:b/>
+          <w:bCs/>
+        </w:rPr>
+        <w:t>Hönnun</w:t>
+      </w:r>
+      <w:proofErr w:type="spellEnd"/>
+      <w:r>
+        <w:rPr>
+          <w:b/>
+          <w:bCs/>
+        </w:rPr>
+        <w:t xml:space="preserve"> is licensed under Creative Commons Attribution (</w:t>
       </w:r>
       <w:hyperlink r:id="rId43" w:history="1">
         <w:r>
@@ -1986,8 +2200,17 @@
           <w:b/>
           <w:bCs/>
         </w:rPr>
-        <w:t>Stylized Fences Set | Agustin Honnun</w:t>
-      </w:r>
+        <w:t xml:space="preserve">Stylized Fences Set | Agustin </w:t>
+      </w:r>
+      <w:proofErr w:type="spellStart"/>
+      <w:r>
+        <w:rPr>
+          <w:b/>
+          <w:bCs/>
+        </w:rPr>
+        <w:t>Honnun</w:t>
+      </w:r>
+      <w:proofErr w:type="spellEnd"/>
       <w:r>
         <w:rPr>
           <w:b/>
@@ -2000,7 +2223,55 @@
           <w:b/>
           <w:bCs/>
         </w:rPr>
-        <w:t>"Stylized Fences Set | Agustin Honnun" (https://skfb.ly/6WsVn) by Agustín Hönnun is licensed under Creative Commons Attribution (</w:t>
+        <w:t xml:space="preserve">"Stylized Fences Set | Agustin </w:t>
+      </w:r>
+      <w:proofErr w:type="spellStart"/>
+      <w:r>
+        <w:rPr>
+          <w:b/>
+          <w:bCs/>
+        </w:rPr>
+        <w:t>Honnun</w:t>
+      </w:r>
+      <w:proofErr w:type="spellEnd"/>
+      <w:r>
+        <w:rPr>
+          <w:b/>
+          <w:bCs/>
+        </w:rPr>
+        <w:t xml:space="preserve">" (https://skfb.ly/6WsVn) by </w:t>
+      </w:r>
+      <w:proofErr w:type="spellStart"/>
+      <w:r>
+        <w:rPr>
+          <w:b/>
+          <w:bCs/>
+        </w:rPr>
+        <w:t>Agustín</w:t>
+      </w:r>
+      <w:proofErr w:type="spellEnd"/>
+      <w:r>
+        <w:rPr>
+          <w:b/>
+          <w:bCs/>
+        </w:rPr>
+        <w:t xml:space="preserve"> </w:t>
+      </w:r>
+      <w:proofErr w:type="spellStart"/>
+      <w:r>
+        <w:rPr>
+          <w:b/>
+          <w:bCs/>
+        </w:rPr>
+        <w:t>Hönnun</w:t>
+      </w:r>
+      <w:proofErr w:type="spellEnd"/>
+      <w:r>
+        <w:rPr>
+          <w:b/>
+          <w:bCs/>
+        </w:rPr>
+        <w:t xml:space="preserve"> is licensed under Creative Commons Attribution (</w:t>
       </w:r>
       <w:hyperlink r:id="rId45" w:history="1">
         <w:r>
@@ -2055,12 +2326,21 @@
           <w:bCs/>
         </w:rPr>
       </w:pPr>
-      <w:r>
-        <w:rPr>
-          <w:b/>
-          <w:bCs/>
-        </w:rPr>
-        <w:t>Lowpoly Hand Painted Wizard Free low-poly 3D model</w:t>
+      <w:proofErr w:type="spellStart"/>
+      <w:r>
+        <w:rPr>
+          <w:b/>
+          <w:bCs/>
+        </w:rPr>
+        <w:t>Lowpoly</w:t>
+      </w:r>
+      <w:proofErr w:type="spellEnd"/>
+      <w:r>
+        <w:rPr>
+          <w:b/>
+          <w:bCs/>
+        </w:rPr>
+        <w:t xml:space="preserve"> Hand Painted Wizard Free low-poly 3D model</w:t>
       </w:r>
       <w:r>
         <w:rPr>
@@ -2102,8 +2382,11 @@
     <w:p>
       <w:pPr>
         <w:pStyle w:val="ListParagraph"/>
-      </w:pPr>
-      <w:hyperlink r:id="rId48" w:history="1">
+        <w:rPr>
+          <w:rStyle w:val="Hyperlink"/>
+        </w:rPr>
+      </w:pPr>
+      <w:hyperlink r:id="rId48" w:anchor="/?page=1&amp;query=peasant&amp;type=Character" w:history="1">
         <w:r>
           <w:rPr>
             <w:rStyle w:val="Hyperlink"/>
@@ -2111,6 +2394,51 @@
           <w:t>https://www.mixamo.com/#/?page=1&amp;query=peasant&amp;type=Character</w:t>
         </w:r>
       </w:hyperlink>
+    </w:p>
+    <w:p>
+      <w:pPr>
+        <w:pStyle w:val="ListParagraph"/>
+        <w:numPr>
+          <w:ilvl w:val="0"/>
+          <w:numId w:val="1"/>
+        </w:numPr>
+        <w:rPr>
+          <w:b/>
+          <w:bCs/>
+        </w:rPr>
+      </w:pPr>
+      <w:r>
+        <w:rPr>
+          <w:b/>
+          <w:bCs/>
+        </w:rPr>
+        <w:t>Chat Conversation PNG Icon</w:t>
+      </w:r>
+      <w:r>
+        <w:rPr>
+          <w:b/>
+          <w:bCs/>
+        </w:rPr>
+        <w:t xml:space="preserve"> –</w:t>
+      </w:r>
+    </w:p>
+    <w:p>
+      <w:pPr>
+        <w:pStyle w:val="ListParagraph"/>
+      </w:pPr>
+      <w:hyperlink r:id="rId49" w:history="1">
+        <w:r>
+          <w:rPr>
+            <w:rStyle w:val="Hyperlink"/>
+          </w:rPr>
+          <w:t>https://www.pngrepo.com/svg/239395/chat-conversation</w:t>
+        </w:r>
+      </w:hyperlink>
+    </w:p>
+    <w:p>
+      <w:pPr>
+        <w:pStyle w:val="ListParagraph"/>
+      </w:pPr>
     </w:p>
     <w:p>
       <w:pPr>
@@ -2142,7 +2470,7 @@
   <w:abstractNum w:abstractNumId="0" w15:restartNumberingAfterBreak="0">
     <w:nsid w:val="6F2A7A11"/>
     <w:multiLevelType w:val="hybridMultilevel"/>
-    <w:tmpl w:val="BC2088BE"/>
+    <w:tmpl w:val="5B52E422"/>
     <w:lvl w:ilvl="0" w:tplc="08090001">
       <w:start w:val="1"/>
       <w:numFmt w:val="bullet"/>

</xml_diff>

<commit_message>
Added Music Assets and Source
</commit_message>
<xml_diff>
--- a/References.docx
+++ b/References.docx
@@ -2444,6 +2444,169 @@
       <w:pPr>
         <w:pStyle w:val="ListParagraph"/>
       </w:pPr>
+    </w:p>
+    <w:p>
+      <w:pPr>
+        <w:jc w:val="center"/>
+        <w:rPr>
+          <w:b/>
+          <w:bCs/>
+          <w:sz w:val="44"/>
+          <w:szCs w:val="44"/>
+        </w:rPr>
+      </w:pPr>
+      <w:r>
+        <w:rPr>
+          <w:b/>
+          <w:bCs/>
+          <w:sz w:val="44"/>
+          <w:szCs w:val="44"/>
+        </w:rPr>
+        <w:t>MUSIC</w:t>
+      </w:r>
+    </w:p>
+    <w:p>
+      <w:pPr>
+        <w:pStyle w:val="ListParagraph"/>
+        <w:numPr>
+          <w:ilvl w:val="0"/>
+          <w:numId w:val="1"/>
+        </w:numPr>
+      </w:pPr>
+      <w:r>
+        <w:rPr>
+          <w:b/>
+          <w:bCs/>
+        </w:rPr>
+        <w:t>Fantasy Music Lite</w:t>
+      </w:r>
+      <w:r>
+        <w:rPr>
+          <w:b/>
+          <w:bCs/>
+        </w:rPr>
+        <w:t xml:space="preserve"> –</w:t>
+      </w:r>
+    </w:p>
+    <w:p>
+      <w:pPr>
+        <w:pStyle w:val="ListParagraph"/>
+      </w:pPr>
+      <w:hyperlink r:id="rId50" w:history="1">
+        <w:r>
+          <w:rPr>
+            <w:rStyle w:val="Hyperlink"/>
+          </w:rPr>
+          <w:t>https://assetstore.unity.com/packages/audio/music/orchestral/fantasy-music-lite-72931</w:t>
+        </w:r>
+      </w:hyperlink>
+    </w:p>
+    <w:p>
+      <w:pPr>
+        <w:pStyle w:val="ListParagraph"/>
+        <w:numPr>
+          <w:ilvl w:val="0"/>
+          <w:numId w:val="1"/>
+        </w:numPr>
+        <w:rPr>
+          <w:b/>
+          <w:bCs/>
+        </w:rPr>
+      </w:pPr>
+      <w:r>
+        <w:rPr>
+          <w:b/>
+          <w:bCs/>
+        </w:rPr>
+        <w:t xml:space="preserve">Fantasy </w:t>
+      </w:r>
+      <w:proofErr w:type="spellStart"/>
+      <w:r>
+        <w:rPr>
+          <w:b/>
+          <w:bCs/>
+        </w:rPr>
+        <w:t>Sfx</w:t>
+      </w:r>
+      <w:proofErr w:type="spellEnd"/>
+      <w:r>
+        <w:rPr>
+          <w:b/>
+          <w:bCs/>
+        </w:rPr>
+        <w:t xml:space="preserve"> – </w:t>
+      </w:r>
+    </w:p>
+    <w:p>
+      <w:pPr>
+        <w:pStyle w:val="ListParagraph"/>
+      </w:pPr>
+      <w:hyperlink r:id="rId51" w:history="1">
+        <w:r>
+          <w:rPr>
+            <w:rStyle w:val="Hyperlink"/>
+          </w:rPr>
+          <w:t>https://assetstore.unity.com/packages/audio/sound-fx/fantasy-sfx-32833</w:t>
+        </w:r>
+      </w:hyperlink>
+    </w:p>
+    <w:p>
+      <w:pPr>
+        <w:pStyle w:val="ListParagraph"/>
+        <w:numPr>
+          <w:ilvl w:val="0"/>
+          <w:numId w:val="1"/>
+        </w:numPr>
+        <w:rPr>
+          <w:b/>
+          <w:bCs/>
+        </w:rPr>
+      </w:pPr>
+      <w:r>
+        <w:rPr>
+          <w:b/>
+          <w:bCs/>
+        </w:rPr>
+        <w:t xml:space="preserve">Monster SFX </w:t>
+      </w:r>
+      <w:r>
+        <w:rPr>
+          <w:b/>
+          <w:bCs/>
+        </w:rPr>
+        <w:t>–</w:t>
+      </w:r>
+      <w:r>
+        <w:rPr>
+          <w:b/>
+          <w:bCs/>
+        </w:rPr>
+        <w:t xml:space="preserve"> 111518</w:t>
+      </w:r>
+      <w:r>
+        <w:rPr>
+          <w:b/>
+          <w:bCs/>
+        </w:rPr>
+        <w:t xml:space="preserve"> – </w:t>
+      </w:r>
+    </w:p>
+    <w:p>
+      <w:pPr>
+        <w:pStyle w:val="ListParagraph"/>
+        <w:rPr>
+          <w:b/>
+          <w:bCs/>
+        </w:rPr>
+      </w:pPr>
+      <w:hyperlink r:id="rId52" w:history="1">
+        <w:r>
+          <w:rPr>
+            <w:rStyle w:val="Hyperlink"/>
+          </w:rPr>
+          <w:t>https://assetstore.unity.com/packages/audio/sound-fx/monster-sfx-111518-132868</w:t>
+        </w:r>
+      </w:hyperlink>
     </w:p>
     <w:p>
       <w:pPr>
@@ -2470,7 +2633,7 @@
   <w:abstractNum w:abstractNumId="0" w15:restartNumberingAfterBreak="0">
     <w:nsid w:val="6F2A7A11"/>
     <w:multiLevelType w:val="hybridMultilevel"/>
-    <w:tmpl w:val="5B52E422"/>
+    <w:tmpl w:val="4DA2A92A"/>
     <w:lvl w:ilvl="0" w:tplc="08090001">
       <w:start w:val="1"/>
       <w:numFmt w:val="bullet"/>

</xml_diff>

<commit_message>
Completed Magic Spells, Created Key and Added Combat Assets
</commit_message>
<xml_diff>
--- a/References.docx
+++ b/References.docx
@@ -2614,13 +2614,7 @@
           <w:rPr>
             <w:rStyle w:val="Hyperlink"/>
           </w:rPr>
-          <w:t>https://assetstore.unity.com/packages/tools/particles-effects/quick-outline-115488</w:t>
-        </w:r>
-        <w:r>
-          <w:rPr>
-            <w:rStyle w:val="Hyperlink"/>
-          </w:rPr>
-          <w:t>v</w:t>
+          <w:t>https://assetstore.unity.com/packages/tools/particles-effects/quick-outline-115488v</w:t>
         </w:r>
       </w:hyperlink>
     </w:p>
@@ -2694,6 +2688,9 @@
     <w:p>
       <w:pPr>
         <w:pStyle w:val="ListParagraph"/>
+        <w:rPr>
+          <w:rStyle w:val="Hyperlink"/>
+        </w:rPr>
       </w:pPr>
       <w:hyperlink r:id="rId54" w:history="1">
         <w:r>
@@ -2703,13 +2700,102 @@
           <w:t>https://assetstore.unity.com/packages/3d/animations/warrior-pack-bundle-1-free-36405</w:t>
         </w:r>
       </w:hyperlink>
+    </w:p>
+    <w:p>
+      <w:pPr>
+        <w:pStyle w:val="ListParagraph"/>
+        <w:numPr>
+          <w:ilvl w:val="0"/>
+          <w:numId w:val="1"/>
+        </w:numPr>
+        <w:rPr>
+          <w:b/>
+          <w:bCs/>
+        </w:rPr>
+      </w:pPr>
+      <w:r>
+        <w:rPr>
+          <w:b/>
+          <w:bCs/>
+        </w:rPr>
+        <w:t>FREE - RPG Weapons</w:t>
+      </w:r>
+      <w:r>
+        <w:rPr>
+          <w:b/>
+          <w:bCs/>
+        </w:rPr>
+        <w:t xml:space="preserve"> –</w:t>
+      </w:r>
+    </w:p>
+    <w:p>
+      <w:pPr>
+        <w:pStyle w:val="ListParagraph"/>
+      </w:pPr>
+      <w:hyperlink r:id="rId55" w:history="1">
+        <w:r>
+          <w:rPr>
+            <w:rStyle w:val="Hyperlink"/>
+          </w:rPr>
+          <w:t>https://assetstore.unity.com/packages/3d/props/weapons/free-rpg-weapons-199738</w:t>
+        </w:r>
+      </w:hyperlink>
+    </w:p>
+    <w:p>
+      <w:pPr>
+        <w:pStyle w:val="ListParagraph"/>
+        <w:numPr>
+          <w:ilvl w:val="0"/>
+          <w:numId w:val="1"/>
+        </w:numPr>
+        <w:rPr>
+          <w:b/>
+          <w:bCs/>
+        </w:rPr>
+      </w:pPr>
+      <w:r>
+        <w:rPr>
+          <w:b/>
+          <w:bCs/>
+        </w:rPr>
+        <w:t>Melee Weapon Trail</w:t>
+      </w:r>
+      <w:r>
+        <w:rPr>
+          <w:b/>
+          <w:bCs/>
+        </w:rPr>
+        <w:t xml:space="preserve"> </w:t>
+      </w:r>
+      <w:r>
+        <w:rPr>
+          <w:b/>
+          <w:bCs/>
+        </w:rPr>
+        <w:t>–</w:t>
+      </w:r>
+    </w:p>
+    <w:p>
+      <w:pPr>
+        <w:pStyle w:val="ListParagraph"/>
+      </w:pPr>
+      <w:hyperlink r:id="rId56" w:history="1">
+        <w:r>
+          <w:rPr>
+            <w:rStyle w:val="Hyperlink"/>
+          </w:rPr>
+          <w:t>https://assetstore.unity.com/packages/tools/particles-effects/melee-weapon-trail-1728</w:t>
+        </w:r>
+      </w:hyperlink>
+    </w:p>
+    <w:p>
+      <w:pPr>
+        <w:pStyle w:val="ListParagraph"/>
+      </w:pPr>
     </w:p>
     <w:p/>
     <w:p/>
     <w:p/>
-    <w:p/>
-    <w:p/>
-    <w:p/>
     <w:p>
       <w:pPr>
         <w:jc w:val="center"/>
@@ -2758,7 +2844,7 @@
       <w:pPr>
         <w:pStyle w:val="ListParagraph"/>
       </w:pPr>
-      <w:hyperlink r:id="rId55" w:history="1">
+      <w:hyperlink r:id="rId57" w:history="1">
         <w:r>
           <w:rPr>
             <w:rStyle w:val="Hyperlink"/>
@@ -2807,7 +2893,7 @@
       <w:pPr>
         <w:pStyle w:val="ListParagraph"/>
       </w:pPr>
-      <w:hyperlink r:id="rId56" w:history="1">
+      <w:hyperlink r:id="rId58" w:history="1">
         <w:r>
           <w:rPr>
             <w:rStyle w:val="Hyperlink"/>
@@ -2861,11 +2947,10 @@
       <w:pPr>
         <w:pStyle w:val="ListParagraph"/>
         <w:rPr>
-          <w:b/>
-          <w:bCs/>
-        </w:rPr>
-      </w:pPr>
-      <w:hyperlink r:id="rId57" w:history="1">
+          <w:rStyle w:val="Hyperlink"/>
+        </w:rPr>
+      </w:pPr>
+      <w:hyperlink r:id="rId59" w:history="1">
         <w:r>
           <w:rPr>
             <w:rStyle w:val="Hyperlink"/>
@@ -2873,6 +2958,107 @@
           <w:t>https://assetstore.unity.com/packages/audio/sound-fx/monster-sfx-111518-132868</w:t>
         </w:r>
       </w:hyperlink>
+    </w:p>
+    <w:p>
+      <w:pPr>
+        <w:pStyle w:val="ListParagraph"/>
+        <w:numPr>
+          <w:ilvl w:val="0"/>
+          <w:numId w:val="1"/>
+        </w:numPr>
+        <w:rPr>
+          <w:b/>
+          <w:bCs/>
+        </w:rPr>
+      </w:pPr>
+      <w:r>
+        <w:rPr>
+          <w:b/>
+          <w:bCs/>
+        </w:rPr>
+        <w:t>Fantasy Tavern Music Pack</w:t>
+      </w:r>
+      <w:r>
+        <w:rPr>
+          <w:b/>
+          <w:bCs/>
+        </w:rPr>
+        <w:t xml:space="preserve"> </w:t>
+      </w:r>
+      <w:r>
+        <w:rPr>
+          <w:b/>
+          <w:bCs/>
+        </w:rPr>
+        <w:t>–</w:t>
+      </w:r>
+    </w:p>
+    <w:p>
+      <w:pPr>
+        <w:pStyle w:val="ListParagraph"/>
+      </w:pPr>
+      <w:hyperlink r:id="rId60" w:history="1">
+        <w:r>
+          <w:rPr>
+            <w:rStyle w:val="Hyperlink"/>
+          </w:rPr>
+          <w:t>https://assetstore.unity.com/packages/audio/music/fantasy-tavern-music-pack-201168</w:t>
+        </w:r>
+      </w:hyperlink>
+    </w:p>
+    <w:p>
+      <w:pPr>
+        <w:pStyle w:val="ListParagraph"/>
+        <w:numPr>
+          <w:ilvl w:val="0"/>
+          <w:numId w:val="1"/>
+        </w:numPr>
+        <w:rPr>
+          <w:b/>
+          <w:bCs/>
+        </w:rPr>
+      </w:pPr>
+      <w:r>
+        <w:rPr>
+          <w:b/>
+          <w:bCs/>
+        </w:rPr>
+        <w:t>Bow and Hammer Sound Effects</w:t>
+      </w:r>
+      <w:r>
+        <w:rPr>
+          <w:b/>
+          <w:bCs/>
+        </w:rPr>
+        <w:t xml:space="preserve"> –</w:t>
+      </w:r>
+    </w:p>
+    <w:p>
+      <w:pPr>
+        <w:pStyle w:val="ListParagraph"/>
+      </w:pPr>
+      <w:hyperlink r:id="rId61" w:history="1">
+        <w:r>
+          <w:rPr>
+            <w:rStyle w:val="Hyperlink"/>
+          </w:rPr>
+          <w:t>https://assetstore.unity.com/packages/audio/sound-fx/weapons/bow-and-hammer-sound-effects-163948</w:t>
+        </w:r>
+      </w:hyperlink>
+    </w:p>
+    <w:p>
+      <w:pPr>
+        <w:pStyle w:val="ListParagraph"/>
+      </w:pPr>
+    </w:p>
+    <w:p>
+      <w:pPr>
+        <w:pStyle w:val="ListParagraph"/>
+        <w:rPr>
+          <w:b/>
+          <w:bCs/>
+        </w:rPr>
+      </w:pPr>
     </w:p>
     <w:p>
       <w:pPr>
@@ -2899,7 +3085,7 @@
   <w:abstractNum w:abstractNumId="0" w15:restartNumberingAfterBreak="0">
     <w:nsid w:val="6F2A7A11"/>
     <w:multiLevelType w:val="hybridMultilevel"/>
-    <w:tmpl w:val="D48449E2"/>
+    <w:tmpl w:val="D94CE520"/>
     <w:lvl w:ilvl="0" w:tplc="08090001">
       <w:start w:val="1"/>
       <w:numFmt w:val="bullet"/>

</xml_diff>